<commit_message>
Refactor K-Factor handling in Testing & Commissioning report to allow manual entry by technicians. Updated flowrate calculations to consistently use m³/h, adjusted related comments, and improved spare parts section visibility based on report type.
</commit_message>
<xml_diff>
--- a/Templates/Report Letter Head.docx
+++ b/Templates/Report Letter Head.docx
@@ -115,7 +115,14 @@
         <w:rtl/>
         <w:lang w:val="fr-FR"/>
       </w:rPr>
-      <w:t xml:space="preserve">ة     </w:t>
+      <w:t xml:space="preserve">ة  </w:t>
+    </w:r>
+    <w:r>
+      <w:rPr>
+        <w:rtl/>
+        <w:lang w:val="fr-FR"/>
+      </w:rPr>
+      <w:t xml:space="preserve"> </w:t>
     </w:r>
   </w:p>
   <w:p>
@@ -150,7 +157,21 @@
         <w:rtl/>
         <w:lang w:val="fr-FR"/>
       </w:rPr>
-      <w:t>الرمز البريدي. 23218, 2163 رقم المبنى 7571</w:t>
+      <w:t>الرمز البريدي. 23218, 2163 رقم المبنى</w:t>
+    </w:r>
+    <w:r>
+      <w:rPr>
+        <w:rtl/>
+        <w:lang w:val="fr-FR"/>
+      </w:rPr>
+      <w:t xml:space="preserve"> </w:t>
+    </w:r>
+    <w:r>
+      <w:rPr>
+        <w:rtl/>
+        <w:lang w:val="fr-FR"/>
+      </w:rPr>
+      <w:t>7571</w:t>
     </w:r>
   </w:p>
   <w:p>
@@ -282,6 +303,12 @@
       <w:rPr>
         <w:lang w:val="fr-FR"/>
       </w:rPr>
+      <w:t xml:space="preserve">                     </w:t>
+    </w:r>
+    <w:r>
+      <w:rPr>
+        <w:lang w:val="fr-FR"/>
+      </w:rPr>
       <w:tab/>
       <w:t xml:space="preserve">   </w:t>
     </w:r>
@@ -290,8 +317,31 @@
         <w:rtl/>
         <w:lang w:val="fr-FR"/>
       </w:rPr>
-      <w:t>رقم المبنى 7571</w:t>
-    </w:r>
+      <w:t xml:space="preserve">رقم </w:t>
+    </w:r>
+    <w:proofErr w:type="gramStart"/>
+    <w:r>
+      <w:rPr>
+        <w:rtl/>
+        <w:lang w:val="fr-FR"/>
+      </w:rPr>
+      <w:t xml:space="preserve">المبنى </w:t>
+    </w:r>
+    <w:r>
+      <w:rPr>
+        <w:rtl/>
+        <w:lang w:val="fr-FR"/>
+      </w:rPr>
+      <w:t xml:space="preserve"> </w:t>
+    </w:r>
+    <w:r>
+      <w:rPr>
+        <w:rtl/>
+        <w:lang w:val="fr-FR"/>
+      </w:rPr>
+      <w:t>7571</w:t>
+    </w:r>
+    <w:proofErr w:type="gramEnd"/>
     <w:r>
       <w:rPr>
         <w:rFonts w:hint="cs"/>
@@ -484,7 +534,19 @@
         <w:lang w:val="fr-FR"/>
       </w:rPr>
       <w:tab/>
-      <w:t xml:space="preserve">               </w:t>
+      <w:t xml:space="preserve">             </w:t>
+    </w:r>
+    <w:r>
+      <w:rPr>
+        <w:lang w:val="fr-FR"/>
+      </w:rPr>
+      <w:t xml:space="preserve">       </w:t>
+    </w:r>
+    <w:r>
+      <w:rPr>
+        <w:lang w:val="fr-FR"/>
+      </w:rPr>
+      <w:t xml:space="preserve">  </w:t>
     </w:r>
     <w:r>
       <w:rPr>

</xml_diff>